<commit_message>
Drept financiar și fiscal TC1: restore original header, polish Romanian wording
Co-Authored-By: Claude Opus 5.5 <noreply@anthropic.com>
Claude-Session: https://claude.ai/code/session_01EotJ1nMywYZ6yH5h4ExWcE
</commit_message>
<xml_diff>
--- a/drept-financiar-si-fiscal/tc1/TC1_DR_Fiscal.docx
+++ b/drept-financiar-si-fiscal/tc1/TC1_DR_Fiscal.docx
@@ -3636,7 +3636,7 @@
                 <w:sz w:val="22"/>
                 <w:szCs w:val="22"/>
               </w:rPr>
-              <w:t xml:space="preserve">Jobul principal. Dacă lucrezi la mai mulți angajatori, alegi doar unul și îi declari că acolo ai funcția de bază (contează, de exemplu, pentru că doar acolo primești deducerea personală la impozit).</w:t>
+              <w:t xml:space="preserve">Jobul principal. Dacă lucrezi pentru mai mulți angajatori, alegi doar unul și îi declari că acolo ai funcția de bază (asta contează, de exemplu, pentru că deducerea personală se acordă doar la funcția de bază).</w:t>
             </w:r>
           </w:p>
         </w:tc>
@@ -3809,7 +3809,7 @@
                 <w:sz w:val="22"/>
                 <w:szCs w:val="22"/>
               </w:rPr>
-              <w:t xml:space="preserve">munca pe cont propriu, fără un șef care să-ți dea ordine: îți alegi singur programul, locul și clienții și îți asumi singur riscurile (ex: un PFA sau un freelancer). Ca să fie considerată independentă, trebuie să bifeze cel puțin 4 din cele 7 criterii.</w:t>
+              <w:t xml:space="preserve">munca pe cont propriu, fără un șef care să-ți dea ordine: îți alegi singur programul, locul și clienții și îți asumi singur riscurile (ex: un PFA sau un freelancer). Ca să fie considerată independentă, activitatea trebuie să îndeplinească cel puțin 4 din cele 7 criterii.</w:t>
             </w:r>
           </w:p>
         </w:tc>
@@ -3959,7 +3959,7 @@
                 <w:sz w:val="22"/>
                 <w:szCs w:val="22"/>
               </w:rPr>
-              <w:t xml:space="preserve">instituțiile care se ocupă efectiv de impozite: Ministerul Finanțelor (prin ANAF) pentru impozitele către stat și direcțiile de taxe și impozite de la primării pentru cele locale (ex: impozitul pe casă).</w:t>
+              <w:t xml:space="preserve">instituțiile care se ocupă efectiv de impozite: Ministerul Finanțelor (prin ANAF) pentru impozitele datorate statului și direcțiile de taxe și impozite de la primării pentru cele locale (ex: impozitul pe casă).</w:t>
             </w:r>
           </w:p>
         </w:tc>
@@ -4034,7 +4034,7 @@
                 <w:sz w:val="22"/>
                 <w:szCs w:val="22"/>
               </w:rPr>
-              <w:t xml:space="preserve">locul de care ești cel mai „legat” în viață: unde îți stă familia, unde lucrezi, unde ai casa, conturile și cardurile la bancă. Se folosește ca să se stabilească în ce țară trebuie să plătești impozit.</w:t>
+              <w:t xml:space="preserve">locul de care ești cel mai „legat” în viață: unde îți e familia, unde lucrezi, unde ai casa, conturile și cardurile la bancă. Contează atunci când se stabilește în ce țară trebuie să plătești impozit.</w:t>
             </w:r>
           </w:p>
         </w:tc>
@@ -4179,7 +4179,7 @@
                 <w:sz w:val="22"/>
                 <w:szCs w:val="22"/>
               </w:rPr>
-              <w:t xml:space="preserve">leasingul „cu gând de cumpărare”: folosești bunul (ex: mașina firmei) aproape toată durata lui de viață și, la final, de regulă devine al tău. Ajunge să fie îndeplinită o singură condiție din cele 5.</w:t>
+              <w:t xml:space="preserve">practic o cumpărare în rate: folosești bunul (ex: mașina firmei) aproape toată durata lui de viață și, la final, de regulă devine al tău. E suficient să fie îndeplinită o singură condiție din cele 5.</w:t>
             </w:r>
           </w:p>
         </w:tc>
@@ -4254,7 +4254,7 @@
                 <w:sz w:val="22"/>
                 <w:szCs w:val="22"/>
               </w:rPr>
-              <w:t xml:space="preserve">Practic o închiriere pe termen lung: folosești bunul o perioadă, plătești rate, iar la final îl dai înapoi, nu devine al tău (ex: firmele care iau mașini în leasing operațional și le schimbă la câțiva ani).</w:t>
+              <w:t xml:space="preserve">Practic o închiriere pe termen lung: folosești bunul o perioadă, plătești rate, iar la final îl dai înapoi, nu devine al tău (ex: firmele care iau mașini în leasing operațional și le schimbă o dată la câțiva ani).</w:t>
             </w:r>
           </w:p>
         </w:tc>
@@ -4680,7 +4680,7 @@
                 <w:sz w:val="22"/>
                 <w:szCs w:val="22"/>
               </w:rPr>
-              <w:t xml:space="preserve">„prețul” banilor: suma pe care o plătești când împrumuți bani (ex: dobânda la credit) sau pe care o primești când îi ții la bancă (ex: dobânda la depozit).</w:t>
+              <w:t xml:space="preserve">„prețul” banilor: suma pe care o plătești când iei bani cu împrumut (ex: dobânda la un credit) sau pe care o primești când îi ții la bancă (ex: dobânda la un depozit).</w:t>
             </w:r>
           </w:p>
         </w:tc>
@@ -4830,7 +4830,7 @@
                 <w:sz w:val="22"/>
                 <w:szCs w:val="22"/>
               </w:rPr>
-              <w:t xml:space="preserve">o asociere care nu plătește ea impozit, ci fiecare asociat plătește pentru partea lui de câștig (ex: o societate civilă formată din doi avocați). Statul practic „se uită prin ea”, direct la asociați.</w:t>
+              <w:t xml:space="preserve">o asociere care nu plătește ea impozit, ci fiecare asociat plătește pentru partea lui de câștig (ex: o societate civilă formată din doi avocați). Practic, statul „se uită prin ea”, direct la asociați.</w:t>
             </w:r>
           </w:p>
         </w:tc>
@@ -4905,7 +4905,7 @@
                 <w:sz w:val="22"/>
                 <w:szCs w:val="22"/>
               </w:rPr>
-              <w:t xml:space="preserve">afacerea „la cheie”: plătești ca să folosești numele, sigla și rețetele unui brand cunoscut și primești ajutor de la ei, dar trebuie să respecți regulile lor (ex: un restaurant McDonald’s deschis de un întreprinzător local).</w:t>
+              <w:t xml:space="preserve">afacerea „la cheie”: plătești ca să folosești numele, sigla și know-how-ul unui brand cunoscut și primești ajutor de la francizor, dar trebuie să respecți regulile lui (ex: un restaurant McDonald’s deschis de un întreprinzător local).</w:t>
             </w:r>
           </w:p>
         </w:tc>
@@ -5055,7 +5055,7 @@
                 <w:sz w:val="22"/>
                 <w:szCs w:val="22"/>
               </w:rPr>
-              <w:t xml:space="preserve">„secretul meseriei”: cunoștințe practice câștigate din experiență, pe care nu le afli doar uitându-te la produs (ex: rețeta exactă a unei băuturi răcoritoare). Nu pot fi dezvăluite fără acordul celui care le deține.</w:t>
+              <w:t xml:space="preserve">„secretul meseriei”: cunoștințe practice dobândite din experiență, pe care nu le afli doar uitându-te la produs (ex: rețeta exactă a unei băuturi răcoritoare). Nu pot fi dezvăluite fără acordul celui care le deține.</w:t>
             </w:r>
           </w:p>
         </w:tc>
@@ -5233,7 +5233,7 @@
                 <w:sz w:val="22"/>
                 <w:szCs w:val="22"/>
               </w:rPr>
-              <w:t xml:space="preserve">Metoda prin care, dacă ai plătit deja impozit în altă țară pentru un venit, suma respectivă se scade din impozitul datorat în România, ca să nu plătești de două ori (ex: datorezi 1.000 lei, ai plătit deja 600 lei afară, deci mai plătești doar 400 lei).</w:t>
+              <w:t xml:space="preserve">Metoda prin care, dacă ai plătit deja impozit în altă țară pentru un venit, suma respectivă se scade din impozitul datorat în România, ca să nu plătești de două ori (ex: datorezi 1.000 lei, ai plătit deja 600 lei în străinătate, deci mai plătești doar 400 lei).</w:t>
             </w:r>
           </w:p>
         </w:tc>
@@ -5458,7 +5458,7 @@
                 <w:sz w:val="22"/>
                 <w:szCs w:val="22"/>
               </w:rPr>
-              <w:t xml:space="preserve">orice persoană sau firmă străină care nu e înregistrată în România (ex: o firmă din Germania care vinde produse unui client român). Plătește impozit în România doar pe banii câștigați de aici.</w:t>
+              <w:t xml:space="preserve">orice persoană sau firmă străină care nu e înregistrată în România (ex: o firmă din Germania care vinde produse unui client român). Plătește impozit aici doar pe banii câștigați din România.</w:t>
             </w:r>
           </w:p>
         </w:tc>
@@ -5533,7 +5533,7 @@
                 <w:sz w:val="22"/>
                 <w:szCs w:val="22"/>
               </w:rPr>
-              <w:t xml:space="preserve">orice cumpărare, vânzare sau folosire a unor acțiuni, obligațiuni sau alte instrumente financiare, indiferent pe ce bursă sau platformă are loc (ex: vinzi acțiuni Apple dintr-o aplicație de trading).</w:t>
+              <w:t xml:space="preserve">orice cumpărare sau vânzare de acțiuni, obligațiuni sau alte instrumente financiare, indiferent pe ce bursă sau platformă se face (ex: vinzi acțiuni Apple dintr-o aplicație de trading).</w:t>
             </w:r>
           </w:p>
         </w:tc>
@@ -5608,7 +5608,7 @@
                 <w:sz w:val="22"/>
                 <w:szCs w:val="22"/>
               </w:rPr>
-              <w:t xml:space="preserve">asociațiile și fundațiile care nu urmăresc profit; banii lor merg doar spre scopuri de interes general sau pentru comunitate (ex: o asociație care ajută animalele fără stăpân).</w:t>
+              <w:t xml:space="preserve">asociațiile și fundațiile care nu urmăresc profit; banii lor sunt folosiți doar pentru scopuri de interes general sau pentru comunitate (ex: o asociație care ajută animalele fără stăpân).</w:t>
             </w:r>
           </w:p>
         </w:tc>
@@ -5814,7 +5814,7 @@
                 <w:sz w:val="22"/>
                 <w:szCs w:val="22"/>
               </w:rPr>
-              <w:t xml:space="preserve">persoanele „legate” între ele: soții și rudele apropiate (până la gradul III), dar și persoanele și firmele în care una deține minim 25% din cealaltă sau o controlează. Fiscul verifică dacă tranzacțiile dintre ele se fac la prețuri normale, nu „de favoare”.</w:t>
+              <w:t xml:space="preserve">persoanele „legate” între ele: soții și rudele apropiate (până la gradul III), dar și o persoană și o firmă sau două firme, atunci când una deține minim 25% din cealaltă sau o controlează. Fiscul verifică dacă tranzacțiile dintre ele se fac la prețuri normale, nu „de favoare”.</w:t>
             </w:r>
           </w:p>
         </w:tc>
@@ -5889,7 +5889,7 @@
                 <w:sz w:val="22"/>
                 <w:szCs w:val="22"/>
               </w:rPr>
-              <w:t xml:space="preserve">persoana care nu îndeplinește niciuna dintre condițiile de rezident (ex: un turist străin venit pentru o lună). Tot nerezidenți sunt și diplomații străini sau angajații organizațiilor internaționale din România, împreună cu familiile lor.</w:t>
+              <w:t xml:space="preserve">persoana care nu îndeplinește niciuna dintre condițiile de rezident (ex: un turist străin venit pentru o lună). Sunt considerați nerezidenți și diplomații străini sau angajații organizațiilor internaționale din România, împreună cu familiile lor.</w:t>
             </w:r>
           </w:p>
         </w:tc>
@@ -6020,7 +6020,7 @@
                 <w:sz w:val="22"/>
                 <w:szCs w:val="22"/>
               </w:rPr>
-              <w:t xml:space="preserve">persoana care, pentru fisc, „aparține” României: are domiciliul aici, își are aici familia și interesele sau stă în țară mai mult de 183 de zile într-un an. Ajunge să fie îndeplinită o singură condiție.</w:t>
+              <w:t xml:space="preserve">persoana care, pentru fisc, „aparține” României: are domiciliul aici, își are aici familia și interesele sau stă în țară mai mult de 183 de zile într-un an. E suficientă o singură condiție.</w:t>
             </w:r>
           </w:p>
         </w:tc>
@@ -6395,7 +6395,7 @@
                 <w:sz w:val="22"/>
                 <w:szCs w:val="22"/>
               </w:rPr>
-              <w:t xml:space="preserve">Regula prin care firmele „legate” între ele trebuie să-și vândă lucruri la prețuri normale. Dacă una îi vinde alteia mai ieftin ca să mute profitul și să plătească impozit mai mic, fiscul recalculează profitul ca și cum prețul ar fi fost cel corect.</w:t>
+              <w:t xml:space="preserve">Regula prin care firmele „legate” între ele trebuie să facă tranzacții la prețuri normale. Dacă una îi vinde alteia mai ieftin ca să mute profitul și să plătească impozit mai mic, fiscul recalculează profitul ca și cum s-ar fi folosit prețul corect.</w:t>
             </w:r>
           </w:p>
         </w:tc>
@@ -6816,7 +6816,7 @@
                 <w:sz w:val="22"/>
                 <w:szCs w:val="22"/>
               </w:rPr>
-              <w:t xml:space="preserve">banii plătiți ca să ai voie să folosești ceva ce aparține altcuiva: o melodie, un brevet, o marcă, un software, know-how sau chiar imaginea unei persoane (ex: un post TV care plătește ca să difuzeze un meci). Dacă însă cumperi dreptul de tot sau doar un program pentru uz propriu, plata nu mai e redevență.</w:t>
+              <w:t xml:space="preserve">banii plătiți ca să ai voie să folosești ceva ce aparține altcuiva: o melodie, un brevet, o marcă, un program, know-how-ul cuiva sau chiar imaginea unei persoane (ex: un post TV care plătește ca să difuzeze un meci). Dacă însă cumperi dreptul definitiv sau cumperi doar un program ca să-l folosești, plata nu mai e redevență.</w:t>
             </w:r>
           </w:p>
         </w:tc>
@@ -6891,7 +6891,7 @@
                 <w:sz w:val="22"/>
                 <w:szCs w:val="22"/>
               </w:rPr>
-              <w:t xml:space="preserve">persoanele și firmele considerate „ale României” din punct de vedere fiscal. Ele plătesc impozit în România pe toți banii câștigați, indiferent dacă i-au câștigat în țară sau în străinătate.</w:t>
+              <w:t xml:space="preserve">persoanele și firmele considerate „ale României” din punct de vedere fiscal. Ele plătesc impozit în România pe toate veniturile, indiferent dacă le-au obținut în țară sau în străinătate.</w:t>
             </w:r>
           </w:p>
         </w:tc>
@@ -6966,7 +6966,7 @@
                 <w:sz w:val="22"/>
                 <w:szCs w:val="22"/>
               </w:rPr>
-              <w:t xml:space="preserve">tot teritoriul țării, inclusiv marea teritorială și spațiul aerian, plus zonele din Marea Neagră unde România are drepturi (ex: platoul continental, de unde se extrage gaz). Acolo se aplică legile fiscale românești.</w:t>
+              <w:t xml:space="preserve">tot teritoriul țării, inclusiv marea teritorială și spațiul aerian, plus zonele din Marea Neagră unde România are drepturi (ex: platoul continental, de unde se extrage gaz). Pe tot acest teritoriu se aplică legile fiscale românești.</w:t>
             </w:r>
           </w:p>
         </w:tc>
@@ -7055,7 +7055,7 @@
                 <w:sz w:val="22"/>
                 <w:szCs w:val="22"/>
               </w:rPr>
-              <w:t xml:space="preserve">Un program prin care firma le dă angajaților sau directorilor dreptul să cumpere acțiuni ale firmei la preț redus sau chiar gratis, ca să-i motiveze. Trebuie să treacă minim un an între acordarea dreptului și cumpărarea acțiunilor.</w:t>
+              <w:t xml:space="preserve">Un program prin care firma le dă angajaților sau directorilor dreptul de a cumpăra acțiuni ale companiei la preț redus sau chiar gratis, ca să-i motiveze. Trebuie să treacă minim un an între acordarea dreptului și cumpărarea acțiunilor.</w:t>
             </w:r>
           </w:p>
         </w:tc>
@@ -7130,7 +7130,7 @@
                 <w:sz w:val="22"/>
                 <w:szCs w:val="22"/>
               </w:rPr>
-              <w:t xml:space="preserve">dovada că deții o „bucată” dintr-o firmă: acțiuni la o societate pe acțiuni sau părți sociale la un SRL (ex: ai 50% din părțile sociale ale unui SRL).</w:t>
+              <w:t xml:space="preserve">„bucata” pe care o deții dintr-o firmă: acțiunile la o societate pe acțiuni sau părțile sociale la un SRL (ex: ai 50% din părțile sociale ale unui SRL).</w:t>
             </w:r>
           </w:p>
         </w:tc>
@@ -7205,7 +7205,7 @@
                 <w:sz w:val="22"/>
                 <w:szCs w:val="22"/>
               </w:rPr>
-              <w:t xml:space="preserve">termenul mai larg care include titlurile de participare, dar și alte instrumente financiare care au valoare, cum ar fi obligațiunile sau unitățile de fond.</w:t>
+              <w:t xml:space="preserve">termenul mai larg care include titlurile de participare, dar și alte instrumente financiare, cum ar fi obligațiunile sau unitățile de fond.</w:t>
             </w:r>
           </w:p>
         </w:tc>
@@ -7355,7 +7355,7 @@
                 <w:sz w:val="22"/>
                 <w:szCs w:val="22"/>
               </w:rPr>
-              <w:t xml:space="preserve">transportul de persoane sau marfă între România și alte țări (ex: un TIR care duce marfă din București la Viena). Dacă transportul se face doar între orașe din România, nu e internațional.</w:t>
+              <w:t xml:space="preserve">transportul de persoane sau de marfă dintr-o țară în alta (ex: un TIR care duce marfă din București la Viena). Dacă transportul se face doar între orașe din România, nu e internațional.</w:t>
             </w:r>
           </w:p>
         </w:tc>
@@ -7514,7 +7514,7 @@
                 <w:sz w:val="22"/>
                 <w:szCs w:val="22"/>
               </w:rPr>
-              <w:t xml:space="preserve">valoarea pe care fiscul o „recunoaște” pentru un bun, o datorie, un provizion sau niște acțiuni atunci când se calculează impozitul (ex: la un mijloc fix, prețul cu care a fost cumpărat, din care se calculează amortizarea fiscală).</w:t>
+              <w:t xml:space="preserve">valoarea pe care fiscul o „recunoaște” pentru un bun, o datorie, un provizion sau niște acțiuni atunci când se calculează impozitul (ex: la un mijloc fix, prețul cu care a fost cumpărat, pe baza căruia se face amortizarea fiscală).</w:t>
             </w:r>
           </w:p>
         </w:tc>
@@ -7734,7 +7734,7 @@
                 <w:sz w:val="22"/>
                 <w:szCs w:val="22"/>
               </w:rPr>
-              <w:t xml:space="preserve">Metoda prin care cel care îți dă banii (ex: angajatorul) îți calculează și îți oprește direct impozitul și contribuțiile și le plătește el la stat, iar tu primești deja suma „netă”.</w:t>
+              <w:t xml:space="preserve">Metoda prin care cel care îți dă banii (ex: angajatorul) îți calculează și îți oprește direct impozitul și contribuțiile și le virează el la stat, iar tu primești deja suma „netă”.</w:t>
             </w:r>
           </w:p>
         </w:tc>
@@ -7884,7 +7884,7 @@
                 <w:sz w:val="22"/>
                 <w:szCs w:val="22"/>
               </w:rPr>
-              <w:t xml:space="preserve">Biserica dintr-o localitate (parohia) sau altă unitate locală a unui cult religios, care are personalitate juridică, încasează venituri și ține o contabilitate simplificată (ex: parohia ortodoxă dintr-un sat).</w:t>
+              <w:t xml:space="preserve">Biserica dintr-o localitate (parohia) sau altă unitate locală a unui cult religios, care are personalitate juridică, încasează venituri și ține contabilitatea în partidă simplă, adică varianta mai ușoară de contabilitate (ex: parohia ortodoxă dintr-un sat).</w:t>
             </w:r>
           </w:p>
         </w:tc>
@@ -8020,7 +8020,7 @@
         <w:sz w:val="20"/>
         <w:szCs w:val="20"/>
       </w:rPr>
-      <w:t xml:space="preserve">TC1 – Drept financiar și fiscal</w:t>
+      <w:t xml:space="preserve">TC1 – Drept financiar si fiscal</w:t>
     </w:r>
     <w:r>
       <w:rPr>

</xml_diff>